<commit_message>
fix sign in profile
</commit_message>
<xml_diff>
--- a/SistemBeritaAcara.Web/wwwroot/files/documents/ba-13-draft.docx
+++ b/SistemBeritaAcara.Web/wwwroot/files/documents/ba-13-draft.docx
@@ -164,35 +164,26 @@
           </w:p>
           <w:p>
             <w:pPr>
-              <w:spacing w:line="276" w:lineRule="auto"/>
               <w:jc w:val="center"/>
-              <w:rPr>
-                <w:lang w:val="nb-NO"/>
-              </w:rPr>
-            </w:pPr>
-            <w:r>
-              <w:t xml:space="preserve">Gd. Wisma Tugu II Lt. 2 Jl. </w:t>
-            </w:r>
-            <w:r>
-              <w:rPr>
-                <w:lang w:val="nb-NO"/>
-              </w:rPr>
-              <w:t>HR Rasuna</w:t>
-            </w:r>
-          </w:p>
-          <w:p>
-            <w:pPr>
-              <w:spacing w:line="276" w:lineRule="auto"/>
+            </w:pPr>
+            <w:r>
+              <w:t xml:space="preserve">Jl. </w:t>
+            </w:r>
+            <w:proofErr w:type="spellStart"/>
+            <w:r>
+              <w:t>Jenderal</w:t>
+            </w:r>
+            <w:proofErr w:type="spellEnd"/>
+            <w:r>
+              <w:t xml:space="preserve"> Ahmad Yani </w:t>
+            </w:r>
+          </w:p>
+          <w:p>
+            <w:pPr>
               <w:jc w:val="center"/>
-              <w:rPr>
-                <w:lang w:val="nb-NO"/>
-              </w:rPr>
-            </w:pPr>
-            <w:r>
-              <w:rPr>
-                <w:lang w:val="nb-NO"/>
-              </w:rPr>
-              <w:t>Said Kav. C 7-9 Kuningan, Jakarta</w:t>
+            </w:pPr>
+            <w:r>
+              <w:t xml:space="preserve">No. 1247, Kel. 14 Ulu, </w:t>
             </w:r>
           </w:p>
           <w:p>
@@ -206,7 +197,21 @@
               <w:rPr>
                 <w:lang w:val="nb-NO"/>
               </w:rPr>
-              <w:t>12290, Indonesia</w:t>
+              <w:t>Kec. Seberang Ulu II,</w:t>
+            </w:r>
+          </w:p>
+          <w:p>
+            <w:pPr>
+              <w:jc w:val="center"/>
+              <w:rPr>
+                <w:lang w:val="nb-NO"/>
+              </w:rPr>
+            </w:pPr>
+            <w:r>
+              <w:rPr>
+                <w:lang w:val="nb-NO"/>
+              </w:rPr>
+              <w:t>Kota Palembang</w:t>
             </w:r>
           </w:p>
           <w:p>
@@ -432,7 +437,7 @@
                       <w:sz w:val="18"/>
                       <w:szCs w:val="18"/>
                     </w:rPr>
-                    <w:t>IT Ssumbagsel</w:t>
+                    <w:t>IT Sumbagsel</w:t>
                   </w:r>
                 </w:p>
               </w:tc>
@@ -522,13 +527,29 @@
           <w:bCs/>
           <w:u w:val="single"/>
         </w:rPr>
-        <w:t>BERITA ACARA ALOKASI BARANG</w:t>
+        <w:t xml:space="preserve">BERITA ACARA ALOKASI BARANG</w:t>
+      </w:r>
+      <w:r>
+        <w:rPr>
+          <w:b/>
+          <w:bCs/>
+          <w:u w:val="single"/>
+        </w:rPr>
+        <w:t/>
+      </w:r>
+      <w:r>
+        <w:rPr>
+          <w:b/>
+          <w:bCs/>
+          <w:u w:val="single"/>
+        </w:rPr>
+        <w:t xml:space="preserve"/>
       </w:r>
     </w:p>
     <w:p/>
     <w:tbl>
       <w:tblPr>
-        <w:tblW w:w="9128" w:type="dxa"/>
+        <w:tblW w:w="9625" w:type="dxa"/>
         <w:tblLayout w:type="fixed"/>
         <w:tblCellMar>
           <w:left w:w="10" w:type="dxa"/>
@@ -537,14 +558,14 @@
         <w:tblLook w:val="04A0" w:firstRow="1" w:lastRow="0" w:firstColumn="1" w:lastColumn="0" w:noHBand="0" w:noVBand="1"/>
       </w:tblPr>
       <w:tblGrid>
-        <w:gridCol w:w="3235"/>
+        <w:gridCol w:w="3775"/>
         <w:gridCol w:w="270"/>
-        <w:gridCol w:w="5623"/>
+        <w:gridCol w:w="5580"/>
       </w:tblGrid>
       <w:tr>
         <w:tc>
           <w:tcPr>
-            <w:tcW w:w="3235" w:type="dxa"/>
+            <w:tcW w:w="3775" w:type="dxa"/>
             <w:tcMar>
               <w:top w:w="60" w:type="dxa"/>
               <w:left w:w="80" w:type="dxa"/>
@@ -565,7 +586,23 @@
                 <w:sz w:val="18"/>
                 <w:szCs w:val="18"/>
               </w:rPr>
-              <w:t>Nama Penanggung Jawab</w:t>
+              <w:t xml:space="preserve">Nama </w:t>
+            </w:r>
+            <w:proofErr w:type="spellStart"/>
+            <w:r>
+              <w:rPr>
+                <w:sz w:val="18"/>
+                <w:szCs w:val="18"/>
+              </w:rPr>
+              <w:t>Penanggung</w:t>
+            </w:r>
+            <w:proofErr w:type="spellEnd"/>
+            <w:r>
+              <w:rPr>
+                <w:sz w:val="18"/>
+                <w:szCs w:val="18"/>
+              </w:rPr>
+              <w:t xml:space="preserve"> Jawab</w:t>
             </w:r>
           </w:p>
         </w:tc>
@@ -598,7 +635,7 @@
         </w:tc>
         <w:tc>
           <w:tcPr>
-            <w:tcW w:w="5623" w:type="dxa"/>
+            <w:tcW w:w="5580" w:type="dxa"/>
             <w:tcMar>
               <w:top w:w="60" w:type="dxa"/>
               <w:left w:w="80" w:type="dxa"/>
@@ -620,13 +657,29 @@
               </w:rPr>
               <w:t>Andika</w:t>
             </w:r>
+            <w:proofErr w:type="spellStart"/>
+            <w:r>
+              <w:rPr>
+                <w:sz w:val="18"/>
+                <w:szCs w:val="18"/>
+              </w:rPr>
+              <w:t/>
+            </w:r>
+            <w:proofErr w:type="spellEnd"/>
+            <w:r>
+              <w:rPr>
+                <w:sz w:val="18"/>
+                <w:szCs w:val="18"/>
+              </w:rPr>
+              <w:t/>
+            </w:r>
           </w:p>
         </w:tc>
       </w:tr>
       <w:tr>
         <w:tc>
           <w:tcPr>
-            <w:tcW w:w="3235" w:type="dxa"/>
+            <w:tcW w:w="3775" w:type="dxa"/>
             <w:tcMar>
               <w:top w:w="60" w:type="dxa"/>
               <w:left w:w="80" w:type="dxa"/>
@@ -680,7 +733,7 @@
         </w:tc>
         <w:tc>
           <w:tcPr>
-            <w:tcW w:w="5623" w:type="dxa"/>
+            <w:tcW w:w="5580" w:type="dxa"/>
             <w:tcMar>
               <w:top w:w="60" w:type="dxa"/>
               <w:left w:w="80" w:type="dxa"/>
@@ -702,13 +755,29 @@
               </w:rPr>
               <w:t>823456</w:t>
             </w:r>
+            <w:proofErr w:type="spellStart"/>
+            <w:r>
+              <w:rPr>
+                <w:sz w:val="18"/>
+                <w:szCs w:val="18"/>
+              </w:rPr>
+              <w:t/>
+            </w:r>
+            <w:proofErr w:type="spellEnd"/>
+            <w:r>
+              <w:rPr>
+                <w:sz w:val="18"/>
+                <w:szCs w:val="18"/>
+              </w:rPr>
+              <w:t/>
+            </w:r>
           </w:p>
         </w:tc>
       </w:tr>
       <w:tr>
         <w:tc>
           <w:tcPr>
-            <w:tcW w:w="3235" w:type="dxa"/>
+            <w:tcW w:w="3775" w:type="dxa"/>
             <w:tcMar>
               <w:top w:w="60" w:type="dxa"/>
               <w:left w:w="80" w:type="dxa"/>
@@ -724,13 +793,15 @@
                 <w:szCs w:val="18"/>
               </w:rPr>
             </w:pPr>
-            <w:r>
-              <w:rPr>
-                <w:sz w:val="18"/>
-                <w:szCs w:val="18"/>
-              </w:rPr>
-              <w:t>J a b a t a n</w:t>
-            </w:r>
+            <w:proofErr w:type="spellStart"/>
+            <w:r>
+              <w:rPr>
+                <w:sz w:val="18"/>
+                <w:szCs w:val="18"/>
+              </w:rPr>
+              <w:t>Jabatan</w:t>
+            </w:r>
+            <w:proofErr w:type="spellEnd"/>
           </w:p>
         </w:tc>
         <w:tc>
@@ -762,7 +833,7 @@
         </w:tc>
         <w:tc>
           <w:tcPr>
-            <w:tcW w:w="5623" w:type="dxa"/>
+            <w:tcW w:w="5580" w:type="dxa"/>
             <w:tcMar>
               <w:top w:w="60" w:type="dxa"/>
               <w:left w:w="80" w:type="dxa"/>
@@ -784,13 +855,29 @@
               </w:rPr>
               <w:t>Inspector II Reliability</w:t>
             </w:r>
+            <w:proofErr w:type="spellStart"/>
+            <w:r>
+              <w:rPr>
+                <w:sz w:val="18"/>
+                <w:szCs w:val="18"/>
+              </w:rPr>
+              <w:t/>
+            </w:r>
+            <w:proofErr w:type="spellEnd"/>
+            <w:r>
+              <w:rPr>
+                <w:sz w:val="18"/>
+                <w:szCs w:val="18"/>
+              </w:rPr>
+              <w:t/>
+            </w:r>
           </w:p>
         </w:tc>
       </w:tr>
       <w:tr>
         <w:tc>
           <w:tcPr>
-            <w:tcW w:w="3235" w:type="dxa"/>
+            <w:tcW w:w="3775" w:type="dxa"/>
             <w:tcMar>
               <w:top w:w="60" w:type="dxa"/>
               <w:left w:w="80" w:type="dxa"/>
@@ -806,13 +893,31 @@
                 <w:szCs w:val="18"/>
               </w:rPr>
             </w:pPr>
-            <w:r>
-              <w:rPr>
-                <w:sz w:val="18"/>
-                <w:szCs w:val="18"/>
-              </w:rPr>
-              <w:t>Fungsi/Direktorat</w:t>
-            </w:r>
+            <w:proofErr w:type="spellStart"/>
+            <w:r>
+              <w:rPr>
+                <w:sz w:val="18"/>
+                <w:szCs w:val="18"/>
+              </w:rPr>
+              <w:t>Fungsi</w:t>
+            </w:r>
+            <w:proofErr w:type="spellEnd"/>
+            <w:r>
+              <w:rPr>
+                <w:sz w:val="18"/>
+                <w:szCs w:val="18"/>
+              </w:rPr>
+              <w:t>/</w:t>
+            </w:r>
+            <w:proofErr w:type="spellStart"/>
+            <w:r>
+              <w:rPr>
+                <w:sz w:val="18"/>
+                <w:szCs w:val="18"/>
+              </w:rPr>
+              <w:t>Direktorat</w:t>
+            </w:r>
+            <w:proofErr w:type="spellEnd"/>
           </w:p>
         </w:tc>
         <w:tc>
@@ -844,7 +949,7 @@
         </w:tc>
         <w:tc>
           <w:tcPr>
-            <w:tcW w:w="5623" w:type="dxa"/>
+            <w:tcW w:w="5580" w:type="dxa"/>
             <w:tcMar>
               <w:top w:w="60" w:type="dxa"/>
               <w:left w:w="80" w:type="dxa"/>
@@ -872,7 +977,7 @@
       <w:tr>
         <w:tc>
           <w:tcPr>
-            <w:tcW w:w="3235" w:type="dxa"/>
+            <w:tcW w:w="3775" w:type="dxa"/>
             <w:tcMar>
               <w:top w:w="60" w:type="dxa"/>
               <w:left w:w="80" w:type="dxa"/>
@@ -926,7 +1031,7 @@
         </w:tc>
         <w:tc>
           <w:tcPr>
-            <w:tcW w:w="5623" w:type="dxa"/>
+            <w:tcW w:w="5580" w:type="dxa"/>
             <w:tcMar>
               <w:top w:w="60" w:type="dxa"/>
               <w:left w:w="80" w:type="dxa"/>
@@ -954,7 +1059,7 @@
       <w:tr>
         <w:tc>
           <w:tcPr>
-            <w:tcW w:w="3235" w:type="dxa"/>
+            <w:tcW w:w="3775" w:type="dxa"/>
             <w:tcMar>
               <w:top w:w="60" w:type="dxa"/>
               <w:left w:w="80" w:type="dxa"/>
@@ -1008,7 +1113,7 @@
         </w:tc>
         <w:tc>
           <w:tcPr>
-            <w:tcW w:w="5623" w:type="dxa"/>
+            <w:tcW w:w="5580" w:type="dxa"/>
             <w:tcMar>
               <w:top w:w="60" w:type="dxa"/>
               <w:left w:w="80" w:type="dxa"/>
@@ -1036,7 +1141,7 @@
       <w:tr>
         <w:tc>
           <w:tcPr>
-            <w:tcW w:w="3235" w:type="dxa"/>
+            <w:tcW w:w="3775" w:type="dxa"/>
             <w:tcMar>
               <w:top w:w="60" w:type="dxa"/>
               <w:left w:w="80" w:type="dxa"/>
@@ -1090,7 +1195,7 @@
         </w:tc>
         <w:tc>
           <w:tcPr>
-            <w:tcW w:w="5623" w:type="dxa"/>
+            <w:tcW w:w="5580" w:type="dxa"/>
             <w:tcMar>
               <w:top w:w="60" w:type="dxa"/>
               <w:left w:w="80" w:type="dxa"/>
@@ -1118,7 +1223,7 @@
       <w:tr>
         <w:tc>
           <w:tcPr>
-            <w:tcW w:w="3235" w:type="dxa"/>
+            <w:tcW w:w="3775" w:type="dxa"/>
             <w:tcMar>
               <w:top w:w="60" w:type="dxa"/>
               <w:left w:w="80" w:type="dxa"/>
@@ -1139,7 +1244,7 @@
                 <w:sz w:val="18"/>
                 <w:szCs w:val="18"/>
               </w:rPr>
-              <w:t>No. Telp / HP</w:t>
+              <w:t>No. Telp/HP</w:t>
             </w:r>
           </w:p>
         </w:tc>
@@ -1172,7 +1277,7 @@
         </w:tc>
         <w:tc>
           <w:tcPr>
-            <w:tcW w:w="5623" w:type="dxa"/>
+            <w:tcW w:w="5580" w:type="dxa"/>
             <w:tcMar>
               <w:top w:w="60" w:type="dxa"/>
               <w:left w:w="80" w:type="dxa"/>
@@ -2571,6 +2676,7 @@
           <w:szCs w:val="18"/>
           <w:lang w:val="nb-NO"/>
         </w:rPr>
+        <w:lastRenderedPageBreak/>
         <w:t>Kami sebagai Penerima/Penanggung Jawab telah membaca, memahami, dan menerima semua ketentuan Perusahaan tersebut.</w:t>
       </w:r>
     </w:p>
@@ -2618,16 +2724,16 @@
         <w:tblStyle w:val="TableGrid"/>
         <w:tblW w:w="0" w:type="auto"/>
         <w:tblInd w:w="360" w:type="dxa"/>
-        <w:tblBorders>
-          <w:top w:val="none" w:color="auto" w:sz="0" w:space="0"/>
-          <w:left w:val="none" w:color="auto" w:sz="0" w:space="0"/>
-          <w:bottom w:val="none" w:color="auto" w:sz="0" w:space="0"/>
-          <w:right w:val="none" w:color="auto" w:sz="0" w:space="0"/>
-          <w:insideH w:val="none" w:color="auto" w:sz="0" w:space="0"/>
-          <w:insideV w:val="none" w:color="auto" w:sz="0" w:space="0"/>
-        </w:tblBorders>
         <w:tblLook w:val="04A0" w:firstRow="1" w:lastRow="0" w:firstColumn="1" w:lastColumn="0" w:noHBand="0" w:noVBand="1"/>
         <w:tblLayout w:type="fixed"/>
+        <w:tblBorders>
+          <w:top w:val="nil"/>
+          <w:left w:val="nil"/>
+          <w:bottom w:val="nil"/>
+          <w:right w:val="nil"/>
+          <w:insideH w:val="nil"/>
+          <w:insideV w:val="nil"/>
+        </w:tblBorders>
       </w:tblPr>
       <w:tblGrid>
         <w:gridCol w:w="3096"/>
@@ -2650,6 +2756,18 @@
                 <w:lang w:val="nb-NO"/>
               </w:rPr>
             </w:pPr>
+          </w:p>
+          <w:p>
+            <w:pPr>
+              <w:pStyle w:val="ListParagraph"/>
+              <w:ind w:left="0"/>
+              <w:rPr>
+                <w:noProof/>
+                <w:sz w:val="18"/>
+                <w:szCs w:val="18"/>
+                <w:lang w:val="nb-NO"/>
+              </w:rPr>
+            </w:pPr>
             <w:r>
               <w:rPr>
                 <w:noProof/>
@@ -2676,15 +2794,6 @@
                 <w:lang w:val="nb-NO"/>
               </w:rPr>
             </w:pPr>
-            <w:r>
-              <w:rPr>
-                <w:noProof/>
-                <w:sz w:val="18"/>
-                <w:szCs w:val="18"/>
-                <w:lang w:val="nb-NO"/>
-              </w:rPr>
-              <w:t>Yang Mengetahui,</w:t>
-            </w:r>
           </w:p>
           <w:p>
             <w:pPr>
@@ -2704,7 +2813,46 @@
                 <w:szCs w:val="18"/>
                 <w:lang w:val="nb-NO"/>
               </w:rPr>
+              <w:t>Yang Mengetahui,</w:t>
+            </w:r>
+          </w:p>
+          <w:p>
+            <w:pPr>
+              <w:pStyle w:val="ListParagraph"/>
+              <w:ind w:left="0"/>
+              <w:rPr>
+                <w:noProof/>
+                <w:sz w:val="18"/>
+                <w:szCs w:val="18"/>
+                <w:lang w:val="nb-NO"/>
+              </w:rPr>
+            </w:pPr>
+            <w:r>
+              <w:rPr>
+                <w:noProof/>
+                <w:sz w:val="18"/>
+                <w:szCs w:val="18"/>
+                <w:lang w:val="nb-NO"/>
+              </w:rPr>
               <w:t>Inspector II Reliability</w:t>
+            </w:r>
+            <w:r>
+              <w:rPr>
+                <w:noProof/>
+                <w:sz w:val="18"/>
+                <w:szCs w:val="18"/>
+                <w:lang w:val="nb-NO"/>
+              </w:rPr>
+              <w:t/>
+            </w:r>
+            <w:r>
+              <w:rPr>
+                <w:noProof/>
+                <w:sz w:val="18"/>
+                <w:szCs w:val="18"/>
+                <w:lang w:val="nb-NO"/>
+              </w:rPr>
+              <w:t/>
             </w:r>
           </w:p>
         </w:tc>
@@ -2753,6 +2901,18 @@
               </w:rPr>
               <w:t>Yang Menerima,</w:t>
             </w:r>
+          </w:p>
+          <w:p>
+            <w:pPr>
+              <w:pStyle w:val="ListParagraph"/>
+              <w:ind w:left="0"/>
+              <w:rPr>
+                <w:noProof/>
+                <w:sz w:val="18"/>
+                <w:szCs w:val="18"/>
+                <w:lang w:val="nb-NO"/>
+              </w:rPr>
+            </w:pPr>
           </w:p>
         </w:tc>
       </w:tr>
@@ -2763,14 +2923,138 @@
           </w:tcPr>
           <w:p>
             <w:pPr>
+              <w:pStyle w:val="ListParagraph"/>
+              <w:ind w:left="0"/>
+              <w:rPr>
+                <w:sz w:val="18"/>
+                <w:szCs w:val="18"/>
+                <w:u w:val="single"/>
+                <w:lang w:val="nb-NO"/>
+              </w:rPr>
+            </w:pPr>
+            <w:r>
+              <w:rPr>
+                <w:color w:val="FFFFFF"/>
+              </w:rPr>
+              <w:t>{{SIG_MENYERAHKAN}}</w:t>
+            </w:r>
+          </w:p>
+          <w:p>
+            <w:pPr>
+              <w:pStyle w:val="ListParagraph"/>
+              <w:ind w:left="0"/>
+              <w:rPr>
+                <w:b/>
+                <w:bCs/>
+                <w:noProof/>
+                <w:sz w:val="18"/>
+                <w:szCs w:val="18"/>
+                <w:u w:val="single"/>
+                <w:lang w:val="nb-NO"/>
+              </w:rPr>
+            </w:pPr>
+            <w:r>
+              <w:rPr>
+                <w:sz w:val="18"/>
+                <w:szCs w:val="18"/>
+                <w:u w:val="single"/>
+                <w:lang w:val="nb-NO"/>
+              </w:rPr>
+              <w:t>-</w:t>
+            </w:r>
+          </w:p>
+        </w:tc>
+        <w:tc>
+          <w:tcPr>
+            <w:tcW w:w="3087" w:type="dxa"/>
+          </w:tcPr>
+          <w:p>
+            <w:pPr>
+              <w:pStyle w:val="ListParagraph"/>
+              <w:ind w:left="0"/>
+              <w:rPr>
+                <w:sz w:val="18"/>
+                <w:szCs w:val="18"/>
+                <w:u w:val="single"/>
+                <w:lang w:val="nb-NO"/>
+              </w:rPr>
+            </w:pPr>
+            <w:r>
+              <w:rPr>
+                <w:color w:val="FFFFFF"/>
+              </w:rPr>
+              <w:t>{{SIG_</w:t>
+            </w:r>
+            <w:r>
+              <w:rPr>
+                <w:color w:val="FFFFFF"/>
+              </w:rPr>
+              <w:t>REVIEWER</w:t>
+            </w:r>
+            <w:r>
+              <w:rPr>
+                <w:color w:val="FFFFFF"/>
+              </w:rPr>
+              <w:t>}}</w:t>
+            </w:r>
+          </w:p>
+          <w:p>
+            <w:pPr>
+              <w:pStyle w:val="ListParagraph"/>
+              <w:ind w:left="0"/>
+              <w:rPr>
+                <w:b/>
+                <w:bCs/>
+                <w:noProof/>
+                <w:sz w:val="18"/>
+                <w:szCs w:val="18"/>
+                <w:u w:val="single"/>
+                <w:lang w:val="nb-NO"/>
+              </w:rPr>
+            </w:pPr>
+            <w:r>
+              <w:rPr>
+                <w:sz w:val="18"/>
+                <w:szCs w:val="18"/>
+                <w:u w:val="single"/>
+                <w:lang w:val="nb-NO"/>
+              </w:rPr>
+              <w:t>Reed Richard</w:t>
+            </w:r>
+            <w:r>
+              <w:rPr>
+                <w:sz w:val="18"/>
+                <w:szCs w:val="18"/>
+                <w:u w:val="single"/>
+                <w:lang w:val="nb-NO"/>
+              </w:rPr>
+              <w:t/>
+            </w:r>
+            <w:r>
+              <w:rPr>
+                <w:sz w:val="18"/>
+                <w:szCs w:val="18"/>
+                <w:u w:val="single"/>
+                <w:lang w:val="nb-NO"/>
+              </w:rPr>
+              <w:t/>
+            </w:r>
+          </w:p>
+        </w:tc>
+        <w:tc>
+          <w:tcPr>
+            <w:tcW w:w="3085" w:type="dxa"/>
+          </w:tcPr>
+          <w:p>
+            <w:pPr>
               <w:ind w:left="0"/>
               <w:jc w:val="left"/>
-              <w:spacing w:after="0"/>
+              <w:spacing w:after="480"/>
             </w:pPr>
             <w:r>
               <w:drawing>
                 <wp:inline distT="0" distB="0" distL="0" distR="0">
-                  <wp:extent cx="1003709" cy="889000"/>
+                  <wp:extent cx="1778000" cy="592666"/>
                   <wp:effectExtent l="0" t="0" r="0" b="0"/>
                   <wp:docPr id="500" name="signature"/>
                   <wp:cNvGraphicFramePr>
@@ -2784,7 +3068,7 @@
                           <pic:cNvPicPr/>
                         </pic:nvPicPr>
                         <pic:blipFill>
-                          <a:blip r:embed="Rb2181dae9c6c4cd7"/>
+                          <a:blip r:embed="R75985ad4b4964b5e"/>
                           <a:stretch>
                             <a:fillRect/>
                           </a:stretch>
@@ -2792,7 +3076,7 @@
                         <pic:spPr>
                           <a:xfrm>
                             <a:off x="0" y="0"/>
-                            <a:ext cx="1003709" cy="889000"/>
+                            <a:ext cx="1778000" cy="592666"/>
                           </a:xfrm>
                           <a:prstGeom prst="rect">
                             <a:avLst/>
@@ -2826,94 +3110,6 @@
                 <w:u w:val="single"/>
                 <w:lang w:val="nb-NO"/>
               </w:rPr>
-              <w:t>Bucky Barnes</w:t>
-            </w:r>
-          </w:p>
-        </w:tc>
-        <w:tc>
-          <w:tcPr>
-            <w:tcW w:w="3087" w:type="dxa"/>
-          </w:tcPr>
-          <w:p>
-            <w:pPr>
-              <w:pStyle w:val="ListParagraph"/>
-              <w:ind w:left="0"/>
-              <w:rPr>
-                <w:sz w:val="18"/>
-                <w:szCs w:val="18"/>
-                <w:u w:val="single"/>
-                <w:lang w:val="nb-NO"/>
-              </w:rPr>
-            </w:pPr>
-            <w:r>
-              <w:rPr>
-                <w:color w:val="FFFFFF"/>
-              </w:rPr>
-              <w:t>{{SIG_APPROVER}}</w:t>
-            </w:r>
-          </w:p>
-          <w:p>
-            <w:pPr>
-              <w:pStyle w:val="ListParagraph"/>
-              <w:ind w:left="0"/>
-              <w:rPr>
-                <w:b/>
-                <w:bCs/>
-                <w:noProof/>
-                <w:sz w:val="18"/>
-                <w:szCs w:val="18"/>
-                <w:u w:val="single"/>
-                <w:lang w:val="nb-NO"/>
-              </w:rPr>
-            </w:pPr>
-            <w:r>
-              <w:rPr>
-                <w:sz w:val="18"/>
-                <w:szCs w:val="18"/>
-                <w:u w:val="single"/>
-                <w:lang w:val="nb-NO"/>
-              </w:rPr>
-              <w:t>Reed Richard</w:t>
-            </w:r>
-          </w:p>
-        </w:tc>
-        <w:tc>
-          <w:tcPr>
-            <w:tcW w:w="3085" w:type="dxa"/>
-          </w:tcPr>
-          <w:p>
-            <w:pPr>
-              <w:pStyle w:val="ListParagraph"/>
-              <w:ind w:left="0"/>
-            </w:pPr>
-            <w:r>
-              <w:rPr>
-                <w:color w:val="FFFFFF"/>
-              </w:rPr>
-              <w:t>{{SIG_PJ}}</w:t>
-            </w:r>
-          </w:p>
-          <w:p>
-            <w:pPr>
-              <w:pStyle w:val="ListParagraph"/>
-              <w:ind w:left="0"/>
-              <w:rPr>
-                <w:b/>
-                <w:bCs/>
-                <w:noProof/>
-                <w:sz w:val="18"/>
-                <w:szCs w:val="18"/>
-                <w:u w:val="single"/>
-                <w:lang w:val="nb-NO"/>
-              </w:rPr>
-            </w:pPr>
-            <w:r>
-              <w:rPr>
-                <w:sz w:val="18"/>
-                <w:szCs w:val="18"/>
-                <w:u w:val="single"/>
-                <w:lang w:val="nb-NO"/>
-              </w:rPr>
               <w:t>Andika</w:t>
             </w:r>
           </w:p>
@@ -2922,140 +3118,17 @@
     </w:tbl>
     <w:p>
       <w:pPr>
+        <w:spacing w:after="160" w:line="278" w:lineRule="auto"/>
         <w:rPr>
           <w:lang w:val="nb-NO"/>
         </w:rPr>
       </w:pPr>
-    </w:p>
-    <w:p>
-      <w:pPr>
-        <w:spacing w:after="160" w:line="278" w:lineRule="auto"/>
+      <w:r>
         <w:rPr>
           <w:lang w:val="nb-NO"/>
         </w:rPr>
-      </w:pPr>
-      <w:r>
-        <w:rPr>
-          <w:lang w:val="nb-NO"/>
-        </w:rPr>
         <w:br w:type="page"/>
       </w:r>
-    </w:p>
-    <w:p>
-      <w:pPr>
-        <w:rPr>
-          <w:lang w:val="nb-NO"/>
-        </w:rPr>
-      </w:pPr>
-      <w:r>
-        <w:rPr>
-          <w:lang w:val="nb-NO"/>
-        </w:rPr>
-        <w:lastRenderedPageBreak/>
-        <w:t>Bukti Foto Alokasi Barang</w:t>
-      </w:r>
-    </w:p>
-    <w:p>
-      <w:pPr>
-        <w:rPr>
-          <w:lang w:val="nb-NO"/>
-        </w:rPr>
-      </w:pPr>
-    </w:p>
-    <w:p>
-      <w:pPr>
-        <w:rPr>
-          <w:sz w:val="18"/>
-          <w:szCs w:val="18"/>
-          <w:lang w:val="nb-NO"/>
-        </w:rPr>
-      </w:pPr>
-      <w:r>
-        <w:rPr>
-          <w:sz w:val="18"/>
-          <w:szCs w:val="18"/>
-          <w:lang w:val="nb-NO"/>
-        </w:rPr>
-        <w:t>Berita acara alokasi CCTV</w:t>
-      </w:r>
-    </w:p>
-    <w:p>
-      <w:pPr>
-        <w:rPr>
-          <w:noProof/>
-          <w:sz w:val="18"/>
-          <w:szCs w:val="18"/>
-        </w:rPr>
-      </w:pPr>
-      <w:r>
-        <w:rPr>
-          <w:sz w:val="18"/>
-          <w:szCs w:val="18"/>
-        </w:rPr>
-        <w:t xml:space="preserve">Sesuai dengan Tiket di My SSC No. yugucqerg</w:t>
-      </w:r>
-      <w:r>
-        <w:rPr>
-          <w:noProof/>
-          <w:sz w:val="18"/>
-          <w:szCs w:val="18"/>
-        </w:rPr>
-        <w:t/>
-      </w:r>
-    </w:p>
-    <w:p>
-      <w:pPr>
-        <w:rPr>
-          <w:sz w:val="18"/>
-          <w:szCs w:val="18"/>
-        </w:rPr>
-      </w:pPr>
-      <w:r>
-        <w:rPr>
-          <w:noProof/>
-          <w:sz w:val="18"/>
-          <w:szCs w:val="18"/>
-        </w:rPr>
-        <w:t xml:space="preserve">Andika - Rel. &amp; Project Dev. Sumbagsel</w:t>
-      </w:r>
-      <w:r>
-        <w:rPr>
-          <w:sz w:val="18"/>
-          <w:szCs w:val="18"/>
-        </w:rPr>
-        <w:t/>
-      </w:r>
-    </w:p>
-    <w:p>
-      <w:pPr>
-        <w:rPr>
-          <w:sz w:val="18"/>
-          <w:szCs w:val="18"/>
-        </w:rPr>
-      </w:pPr>
-      <w:r>
-        <w:rPr>
-          <w:sz w:val="18"/>
-          <w:szCs w:val="18"/>
-        </w:rPr>
-        <w:t>29 Juni 2026</w:t>
-      </w:r>
-    </w:p>
-    <w:p>
-      <w:pPr>
-        <w:rPr>
-          <w:sz w:val="18"/>
-          <w:szCs w:val="18"/>
-        </w:rPr>
-      </w:pPr>
-    </w:p>
-    <w:p>
-      <w:pPr>
-        <w:rPr>
-          <w:sz w:val="18"/>
-          <w:szCs w:val="18"/>
-        </w:rPr>
-      </w:pPr>
     </w:p>
     <w:sectPr>
       <w:pgSz w:w="11906" w:h="16838" w:code="9"/>
@@ -3063,48 +3136,6 @@
       <w:cols w:space="720"/>
       <w:docGrid w:linePitch="360"/>
     </w:sectPr>
-    <w:p>
-      <w:pPr>
-        <w:jc w:val="center"/>
-      </w:pPr>
-      <w:r>
-        <w:drawing>
-          <wp:inline distT="0" distB="0" distL="0" distR="0">
-            <wp:extent cx="3254148" cy="5400000"/>
-            <wp:effectExtent l="0" t="0" r="0" b="0"/>
-            <wp:docPr id="100" name="ba-13-photo-1-1782720540974.png"/>
-            <wp:cNvGraphicFramePr>
-              <a:graphicFrameLocks noChangeAspect="1"/>
-            </wp:cNvGraphicFramePr>
-            <a:graphic>
-              <a:graphicData uri="http://schemas.openxmlformats.org/drawingml/2006/picture">
-                <pic:pic>
-                  <pic:nvPicPr>
-                    <pic:cNvPr id="100" name="ba-13-photo-1-1782720540974.png"/>
-                    <pic:cNvPicPr/>
-                  </pic:nvPicPr>
-                  <pic:blipFill>
-                    <a:blip r:embed="Ra9d4fd812dd046a7"/>
-                    <a:stretch>
-                      <a:fillRect/>
-                    </a:stretch>
-                  </pic:blipFill>
-                  <pic:spPr>
-                    <a:xfrm>
-                      <a:off x="0" y="0"/>
-                      <a:ext cx="3254148" cy="5400000"/>
-                    </a:xfrm>
-                    <a:prstGeom prst="rect">
-                      <a:avLst/>
-                    </a:prstGeom>
-                  </pic:spPr>
-                </pic:pic>
-              </a:graphicData>
-            </a:graphic>
-          </wp:inline>
-        </w:drawing>
-      </w:r>
-    </w:p>
   </w:body>
 </w:document>
 </file>

</xml_diff>